<commit_message>
docs: position TenSpur as an enterprise product library
</commit_message>
<xml_diff>
--- a/docs/DEVELOPER_GUIDE.docx
+++ b/docs/DEVELOPER_GUIDE.docx
@@ -223,111 +223,85 @@
       </w:pPr>
       <w:r>
         <w:rPr/>
-        <w:t xml:space="preserve">天枢 </w:t>
-      </w:r>
-      <w:r>
-        <w:rPr/>
-        <w:t xml:space="preserve">TenSpur </w:t>
-      </w:r>
-      <w:r>
-        <w:rPr/>
-        <w:t xml:space="preserve">是硬件产品资料与选型平台，包含硬件产品规格目录、管理后台与证据约束型 </w:t>
-      </w:r>
-      <w:r>
-        <w:rPr/>
-        <w:t xml:space="preserve">AI </w:t>
-      </w:r>
-      <w:r>
-        <w:rPr/>
-        <w:t xml:space="preserve">选型。公开 </w:t>
-      </w:r>
-      <w:r>
-        <w:rPr/>
-        <w:t xml:space="preserve">App </w:t>
-      </w:r>
-      <w:r>
-        <w:rPr/>
-        <w:t>负责按品牌</w:t>
-      </w:r>
-      <w:r>
-        <w:rPr/>
-        <w:t>/</w:t>
-      </w:r>
-      <w:r>
-        <w:rPr/>
-        <w:t>产品类型</w:t>
-      </w:r>
-      <w:r>
-        <w:rPr/>
-        <w:t>/</w:t>
-      </w:r>
-      <w:r>
-        <w:rPr/>
-        <w:t>系列浏览、全文检索、型号详情、</w:t>
-      </w:r>
-      <w:r>
-        <w:rPr/>
-        <w:t>GPU</w:t>
-      </w:r>
-      <w:r>
-        <w:rPr/>
-        <w:t>兼容关系、生命周期标签与多型号对比；</w:t>
-      </w:r>
-      <w:r>
-        <w:rPr/>
-        <w:t xml:space="preserve">Admin </w:t>
-      </w:r>
-      <w:r>
-        <w:rPr/>
-        <w:t>负责受认证的型号</w:t>
-      </w:r>
-      <w:r>
-        <w:rPr/>
-        <w:t>/</w:t>
-      </w:r>
-      <w:r>
-        <w:rPr/>
-        <w:t>规格维护、</w:t>
-      </w:r>
-      <w:r>
-        <w:rPr/>
-        <w:t>Excel/Markdown</w:t>
-      </w:r>
-      <w:r>
-        <w:rPr/>
-        <w:t>导入、规格识别、</w:t>
-      </w:r>
-      <w:r>
-        <w:rPr/>
-        <w:t xml:space="preserve">AI Provider </w:t>
-      </w:r>
-      <w:r>
-        <w:rPr/>
-        <w:t xml:space="preserve">与固定规则 </w:t>
-      </w:r>
-      <w:r>
-        <w:rPr/>
-        <w:t>MD</w:t>
-      </w:r>
-      <w:r>
-        <w:rPr/>
-        <w:t>。</w:t>
-      </w:r>
-      <w:r>
-        <w:rPr/>
-        <w:t xml:space="preserve">AI </w:t>
-      </w:r>
-      <w:r>
-        <w:rPr/>
-        <w:t>不能替代本地证据：候选、条件矩阵和无证据拒答由后端确定，</w:t>
-      </w:r>
-      <w:r>
-        <w:rPr/>
-        <w:t xml:space="preserve">Provider </w:t>
-      </w:r>
-      <w:r>
-        <w:rPr/>
-        <w:t>只补充风险说明。</w:t>
+        <w:t>天枢 TenSpur 是企业产品库，即面向企业的产品资料管理、分类检索、产品对比与辅助选型平台，支持软件、硬件及其他产品类型的统一管理。公开 App 负责按品牌/产品类型/系列浏览、全文检索、型号详情、当前已有的 GPU 兼容关系、生命周期标签与多型号对比；Admin 负责受认证的型号/规格维护、Excel/Markdown 导入、规格识别、AI Provider 与固定规则 MD。源码中的 hardware 等包名、迁移名和代码标识属于历史技术标识，不代表产品边界。AI 不能替代本地证据：候选、条件矩阵和无证据拒答由后端确定，Provider 只补充风险说明。</w:t>
+      </w:r>
+      <w:r>
+        <w:rPr/>
+      </w:r>
+      <w:r>
+        <w:rPr/>
+      </w:r>
+      <w:r>
+        <w:rPr/>
+      </w:r>
+      <w:r>
+        <w:rPr/>
+      </w:r>
+      <w:r>
+        <w:rPr/>
+      </w:r>
+      <w:r>
+        <w:rPr/>
+      </w:r>
+      <w:r>
+        <w:rPr/>
+      </w:r>
+      <w:r>
+        <w:rPr/>
+      </w:r>
+      <w:r>
+        <w:rPr/>
+      </w:r>
+      <w:r>
+        <w:rPr/>
+      </w:r>
+      <w:r>
+        <w:rPr/>
+      </w:r>
+      <w:r>
+        <w:rPr/>
+      </w:r>
+      <w:r>
+        <w:rPr/>
+      </w:r>
+      <w:r>
+        <w:rPr/>
+      </w:r>
+      <w:r>
+        <w:rPr/>
+      </w:r>
+      <w:r>
+        <w:rPr/>
+      </w:r>
+      <w:r>
+        <w:rPr/>
+      </w:r>
+      <w:r>
+        <w:rPr/>
+      </w:r>
+      <w:r>
+        <w:rPr/>
+      </w:r>
+      <w:r>
+        <w:rPr/>
+      </w:r>
+      <w:r>
+        <w:rPr/>
+      </w:r>
+      <w:r>
+        <w:rPr/>
+      </w:r>
+      <w:r>
+        <w:rPr/>
+      </w:r>
+      <w:r>
+        <w:rPr/>
+      </w:r>
+      <w:r>
+        <w:rPr/>
+      </w:r>
+      <w:r>
+        <w:rPr/>
       </w:r>
     </w:p>
     <w:p>

</xml_diff>